<commit_message>
added current reposbilities text entry to step1 and minor bug fixes for post-download message
</commit_message>
<xml_diff>
--- a/resume-scrubber/backend/FRM-11110-Template.docx
+++ b/resume-scrubber/backend/FRM-11110-Template.docx
@@ -138,6 +138,7 @@
             </w:placeholder>
             <w:text/>
           </w:sdtPr>
+          <w:sdtEndPr/>
           <w:sdtContent>
             <w:tc>
               <w:tcPr>
@@ -323,7 +324,6 @@
               <w:placeholder>
                 <w:docPart w:val="8DA36EAAEC454ECE9DCFF61E283C8D3F"/>
               </w:placeholder>
-              <w:showingPlcHdr/>
             </w:sdtPr>
             <w:sdtEndPr>
               <w:rPr>
@@ -333,20 +333,22 @@
               </w:rPr>
             </w:sdtEndPr>
             <w:sdtContent>
-              <w:p>
-                <w:r>
-                  <w:rPr>
-                    <w:rStyle w:val="PlaceholderText"/>
-                  </w:rPr>
-                  <w:t>Describe your current responsibilities at Gilead</w:t>
-                </w:r>
-              </w:p>
               <w:p>
                 <w:pPr>
                   <w:rPr>
                     <w:b/>
                   </w:rPr>
                 </w:pPr>
+                <w:r>
+                  <w:rPr>
+                    <w:rStyle w:val="BodyTextChar"/>
+                    <w:rFonts w:eastAsiaTheme="minorHAnsi"/>
+                  </w:rPr>
+                  <w:t>INSERT_RESPONSIBILITIES</w:t>
+                </w:r>
+                <w:r>
+                  <w:t xml:space="preserve"> </w:t>
+                </w:r>
               </w:p>
             </w:sdtContent>
           </w:sdt>
@@ -487,6 +489,7 @@
                 <w:docPart w:val="9A35B3537E834E548121D36A7EC12476"/>
               </w:placeholder>
             </w:sdtPr>
+            <w:sdtEndPr/>
             <w:sdtContent>
               <w:p>
                 <w:r>
@@ -1719,7 +1722,7 @@
       <w:rPr>
         <w:noProof/>
       </w:rPr>
-      <w:pict w14:anchorId="7764C9DB">
+      <w:pict w14:anchorId="1C30F820">
         <v:shapetype id="_x0000_t136" coordsize="21600,21600" o:spt="136" adj="10800" path="m@7,l@8,m@5,21600l@6,21600e">
           <v:formulas>
             <v:f eqn="sum #0 0 10800"/>
@@ -2089,7 +2092,7 @@
       <w:rPr>
         <w:noProof/>
       </w:rPr>
-      <w:pict w14:anchorId="0C07BEB5">
+      <w:pict w14:anchorId="6144B438">
         <v:shapetype id="_x0000_t136" coordsize="21600,21600" o:spt="136" adj="10800" path="m@7,l@8,m@5,21600l@6,21600e">
           <v:formulas>
             <v:f eqn="sum #0 0 10800"/>
@@ -2135,7 +2138,7 @@
       <w:rPr>
         <w:noProof/>
       </w:rPr>
-      <w:pict w14:anchorId="36E9114A">
+      <w:pict w14:anchorId="3090BB4E">
         <v:shapetype id="_x0000_t136" coordsize="21600,21600" o:spt="136" adj="10800" path="m@7,l@8,m@5,21600l@6,21600e">
           <v:formulas>
             <v:f eqn="sum #0 0 10800"/>
@@ -2181,7 +2184,7 @@
       <w:rPr>
         <w:noProof/>
       </w:rPr>
-      <w:pict w14:anchorId="0BC6B454">
+      <w:pict w14:anchorId="33CBAA85">
         <v:shapetype id="_x0000_t136" coordsize="21600,21600" o:spt="136" adj="10800" path="m@7,l@8,m@5,21600l@6,21600e">
           <v:formulas>
             <v:f eqn="sum #0 0 10800"/>
@@ -2526,7 +2529,7 @@
       <w:rPr>
         <w:noProof/>
       </w:rPr>
-      <w:pict w14:anchorId="12793316">
+      <w:pict w14:anchorId="6BB0B09B">
         <v:shapetype id="_x0000_t136" coordsize="21600,21600" o:spt="136" adj="10800" path="m@7,l@8,m@5,21600l@6,21600e">
           <v:formulas>
             <v:f eqn="sum #0 0 10800"/>
@@ -2572,7 +2575,7 @@
       <w:rPr>
         <w:noProof/>
       </w:rPr>
-      <w:pict w14:anchorId="3C55921F">
+      <w:pict w14:anchorId="5AD77B39">
         <v:shapetype id="_x0000_t136" coordsize="21600,21600" o:spt="136" adj="10800" path="m@7,l@8,m@5,21600l@6,21600e">
           <v:formulas>
             <v:f eqn="sum #0 0 10800"/>
@@ -6401,6 +6404,7 @@
   <w:rsids>
     <w:rsidRoot w:val="000536F4"/>
     <w:rsid w:val="000536F4"/>
+    <w:rsid w:val="00097DE4"/>
     <w:rsid w:val="00100FCF"/>
     <w:rsid w:val="00124A1F"/>
     <w:rsid w:val="00186304"/>
@@ -6419,6 +6423,7 @@
     <w:rsid w:val="00866C31"/>
     <w:rsid w:val="009774B3"/>
     <w:rsid w:val="009839F3"/>
+    <w:rsid w:val="00997FA6"/>
     <w:rsid w:val="009A5237"/>
     <w:rsid w:val="00A31A9C"/>
     <w:rsid w:val="00B12D04"/>

</xml_diff>

<commit_message>
Add entry spacing, template guide, update docs with legacy files and NER model info
</commit_message>
<xml_diff>
--- a/resume-scrubber/backend/FRM-11110-Template.docx
+++ b/resume-scrubber/backend/FRM-11110-Template.docx
@@ -6,12 +6,12 @@
       <w:tblPr>
         <w:tblW w:w="9648" w:type="dxa"/>
         <w:tblBorders>
-          <w:top w:val="single" w:sz="12" w:space="0" w:color="auto"/>
-          <w:left w:val="single" w:sz="12" w:space="0" w:color="auto"/>
-          <w:bottom w:val="single" w:sz="12" w:space="0" w:color="auto"/>
-          <w:right w:val="single" w:sz="12" w:space="0" w:color="auto"/>
-          <w:insideH w:val="single" w:sz="12" w:space="0" w:color="auto"/>
-          <w:insideV w:val="single" w:sz="12" w:space="0" w:color="auto"/>
+          <w:top w:val="single" w:color="auto" w:sz="12" w:space="0"/>
+          <w:left w:val="single" w:color="auto" w:sz="12" w:space="0"/>
+          <w:bottom w:val="single" w:color="auto" w:sz="12" w:space="0"/>
+          <w:right w:val="single" w:color="auto" w:sz="12" w:space="0"/>
+          <w:insideH w:val="single" w:color="auto" w:sz="12" w:space="0"/>
+          <w:insideV w:val="single" w:color="auto" w:sz="12" w:space="0"/>
         </w:tblBorders>
         <w:tblLook w:val="01E0" w:firstRow="1" w:lastRow="1" w:firstColumn="1" w:lastColumn="1" w:noHBand="0" w:noVBand="0"/>
       </w:tblPr>
@@ -34,7 +34,7 @@
                 <w:noProof/>
               </w:rPr>
               <w:pict w14:anchorId="4C5E2558">
-                <v:shapetype id="_x0000_t75" coordsize="21600,21600" o:spt="75" o:preferrelative="t" path="m@4@5l@4@11@9@11@9@5xe" filled="f" stroked="f">
+                <v:shapetype id="_x0000_t75" coordsize="21600,21600" filled="f" stroked="f" o:spt="75" o:preferrelative="t" path="m@4@5l@4@11@9@11@9@5xe">
                   <v:stroke joinstyle="miter"/>
                   <v:formulas>
                     <v:f eqn="if lineDrawn pixelLineWidth 0"/>
@@ -50,11 +50,11 @@
                     <v:f eqn="prod @7 21600 pixelHeight"/>
                     <v:f eqn="sum @10 21600 0"/>
                   </v:formulas>
-                  <v:path o:extrusionok="f" gradientshapeok="t" o:connecttype="rect"/>
+                  <v:path gradientshapeok="t" o:connecttype="rect" o:extrusionok="f"/>
                   <o:lock v:ext="edit" aspectratio="t"/>
                 </v:shapetype>
-                <v:shape id="_x0000_s1026" type="#_x0000_t75" alt="" style="position:absolute;margin-left:5.4pt;margin-top:9.05pt;width:99pt;height:26.95pt;z-index:251658240;mso-wrap-edited:f;mso-width-percent:0;mso-height-percent:0;mso-width-percent:0;mso-height-percent:0" fillcolor="window">
-                  <v:imagedata r:id="rId7" o:title=""/>
+                <v:shape id="_x0000_s1026" style="position:absolute;margin-left:5.4pt;margin-top:9.05pt;width:99pt;height:26.95pt;z-index:251658240;mso-wrap-edited:f;mso-width-percent:0;mso-height-percent:0;mso-width-percent:0;mso-height-percent:0" alt="" fillcolor="window" type="#_x0000_t75">
+                  <v:imagedata o:title="" r:id="rId7"/>
                 </v:shape>
               </w:pict>
             </w:r>
@@ -120,12 +120,12 @@
         <w:tblStyle w:val="TableGrid"/>
         <w:tblW w:w="9720" w:type="dxa"/>
         <w:tblBorders>
-          <w:top w:val="none" w:sz="0" w:space="0" w:color="auto"/>
-          <w:left w:val="none" w:sz="0" w:space="0" w:color="auto"/>
-          <w:bottom w:val="none" w:sz="0" w:space="0" w:color="auto"/>
-          <w:right w:val="none" w:sz="0" w:space="0" w:color="auto"/>
-          <w:insideH w:val="none" w:sz="0" w:space="0" w:color="auto"/>
-          <w:insideV w:val="none" w:sz="0" w:space="0" w:color="auto"/>
+          <w:top w:val="none" w:color="auto" w:sz="0" w:space="0"/>
+          <w:left w:val="none" w:color="auto" w:sz="0" w:space="0"/>
+          <w:bottom w:val="none" w:color="auto" w:sz="0" w:space="0"/>
+          <w:right w:val="none" w:color="auto" w:sz="0" w:space="0"/>
+          <w:insideH w:val="none" w:color="auto" w:sz="0" w:space="0"/>
+          <w:insideV w:val="none" w:color="auto" w:sz="0" w:space="0"/>
         </w:tblBorders>
         <w:tblLook w:val="04A0" w:firstRow="1" w:lastRow="0" w:firstColumn="1" w:lastColumn="0" w:noHBand="0" w:noVBand="1"/>
       </w:tblPr>
@@ -302,12 +302,12 @@
         <w:tblStyle w:val="TableGrid"/>
         <w:tblW w:w="9715" w:type="dxa"/>
         <w:tblBorders>
-          <w:top w:val="none" w:sz="0" w:space="0" w:color="auto"/>
-          <w:left w:val="none" w:sz="0" w:space="0" w:color="auto"/>
-          <w:bottom w:val="none" w:sz="0" w:space="0" w:color="auto"/>
-          <w:right w:val="none" w:sz="0" w:space="0" w:color="auto"/>
-          <w:insideH w:val="none" w:sz="0" w:space="0" w:color="auto"/>
-          <w:insideV w:val="none" w:sz="0" w:space="0" w:color="auto"/>
+          <w:top w:val="none" w:color="auto" w:sz="0" w:space="0"/>
+          <w:left w:val="none" w:color="auto" w:sz="0" w:space="0"/>
+          <w:bottom w:val="none" w:color="auto" w:sz="0" w:space="0"/>
+          <w:right w:val="none" w:color="auto" w:sz="0" w:space="0"/>
+          <w:insideH w:val="none" w:color="auto" w:sz="0" w:space="0"/>
+          <w:insideV w:val="none" w:color="auto" w:sz="0" w:space="0"/>
         </w:tblBorders>
         <w:tblLook w:val="04A0" w:firstRow="1" w:lastRow="0" w:firstColumn="1" w:lastColumn="0" w:noHBand="0" w:noVBand="1"/>
       </w:tblPr>
@@ -319,10 +319,10 @@
           <w:tcPr>
             <w:tcW w:w="9715" w:type="dxa"/>
             <w:tcBorders>
-              <w:top w:val="single" w:sz="4" w:space="0" w:color="auto"/>
-              <w:left w:val="single" w:sz="4" w:space="0" w:color="auto"/>
-              <w:bottom w:val="single" w:sz="4" w:space="0" w:color="auto"/>
-              <w:right w:val="single" w:sz="4" w:space="0" w:color="auto"/>
+              <w:top w:val="single" w:color="auto" w:sz="4" w:space="0"/>
+              <w:left w:val="single" w:color="auto" w:sz="4" w:space="0"/>
+              <w:bottom w:val="single" w:color="auto" w:sz="4" w:space="0"/>
+              <w:right w:val="single" w:color="auto" w:sz="4" w:space="0"/>
             </w:tcBorders>
             <w:vAlign w:val="center"/>
           </w:tcPr>
@@ -349,8 +349,8 @@
           <w:tcPr>
             <w:tcW w:w="9715" w:type="dxa"/>
             <w:tcBorders>
-              <w:top w:val="single" w:sz="4" w:space="0" w:color="auto"/>
-              <w:bottom w:val="single" w:sz="4" w:space="0" w:color="auto"/>
+              <w:top w:val="single" w:color="auto" w:sz="4" w:space="0"/>
+              <w:bottom w:val="single" w:color="auto" w:sz="4" w:space="0"/>
             </w:tcBorders>
           </w:tcPr>
           <w:p>
@@ -395,10 +395,10 @@
           <w:tcPr>
             <w:tcW w:w="9715" w:type="dxa"/>
             <w:tcBorders>
-              <w:top w:val="single" w:sz="4" w:space="0" w:color="auto"/>
-              <w:left w:val="single" w:sz="4" w:space="0" w:color="auto"/>
-              <w:bottom w:val="single" w:sz="4" w:space="0" w:color="auto"/>
-              <w:right w:val="single" w:sz="4" w:space="0" w:color="auto"/>
+              <w:top w:val="single" w:color="auto" w:sz="4" w:space="0"/>
+              <w:left w:val="single" w:color="auto" w:sz="4" w:space="0"/>
+              <w:bottom w:val="single" w:color="auto" w:sz="4" w:space="0"/>
+              <w:right w:val="single" w:color="auto" w:sz="4" w:space="0"/>
             </w:tcBorders>
             <w:vAlign w:val="center"/>
           </w:tcPr>
@@ -425,8 +425,8 @@
           <w:tcPr>
             <w:tcW w:w="9715" w:type="dxa"/>
             <w:tcBorders>
-              <w:top w:val="single" w:sz="4" w:space="0" w:color="auto"/>
-              <w:bottom w:val="single" w:sz="4" w:space="0" w:color="auto"/>
+              <w:top w:val="single" w:color="auto" w:sz="4" w:space="0"/>
+              <w:bottom w:val="single" w:color="auto" w:sz="4" w:space="0"/>
             </w:tcBorders>
           </w:tcPr>
           <w:p>
@@ -478,10 +478,10 @@
           <w:tcPr>
             <w:tcW w:w="9715" w:type="dxa"/>
             <w:tcBorders>
-              <w:top w:val="single" w:sz="4" w:space="0" w:color="auto"/>
-              <w:left w:val="single" w:sz="4" w:space="0" w:color="auto"/>
-              <w:bottom w:val="single" w:sz="4" w:space="0" w:color="auto"/>
-              <w:right w:val="single" w:sz="4" w:space="0" w:color="auto"/>
+              <w:top w:val="single" w:color="auto" w:sz="4" w:space="0"/>
+              <w:left w:val="single" w:color="auto" w:sz="4" w:space="0"/>
+              <w:bottom w:val="single" w:color="auto" w:sz="4" w:space="0"/>
+              <w:right w:val="single" w:color="auto" w:sz="4" w:space="0"/>
             </w:tcBorders>
             <w:vAlign w:val="center"/>
           </w:tcPr>
@@ -518,7 +518,7 @@
           <w:tcPr>
             <w:tcW w:w="9715" w:type="dxa"/>
             <w:tcBorders>
-              <w:top w:val="single" w:sz="4" w:space="0" w:color="auto"/>
+              <w:top w:val="single" w:color="auto" w:sz="4" w:space="0"/>
             </w:tcBorders>
           </w:tcPr>
           <w:p>
@@ -550,11 +550,11 @@
         <w:tblStyle w:val="TableGrid"/>
         <w:tblW w:w="9720" w:type="dxa"/>
         <w:tblBorders>
-          <w:left w:val="none" w:sz="0" w:space="0" w:color="auto"/>
-          <w:bottom w:val="none" w:sz="0" w:space="0" w:color="auto"/>
-          <w:right w:val="none" w:sz="0" w:space="0" w:color="auto"/>
-          <w:insideH w:val="none" w:sz="0" w:space="0" w:color="auto"/>
-          <w:insideV w:val="none" w:sz="0" w:space="0" w:color="auto"/>
+          <w:left w:val="none" w:color="auto" w:sz="0" w:space="0"/>
+          <w:bottom w:val="none" w:color="auto" w:sz="0" w:space="0"/>
+          <w:right w:val="none" w:color="auto" w:sz="0" w:space="0"/>
+          <w:insideH w:val="none" w:color="auto" w:sz="0" w:space="0"/>
+          <w:insideV w:val="none" w:color="auto" w:sz="0" w:space="0"/>
         </w:tblBorders>
         <w:tblLook w:val="04A0" w:firstRow="1" w:lastRow="0" w:firstColumn="1" w:lastColumn="0" w:noHBand="0" w:noVBand="1"/>
       </w:tblPr>
@@ -596,9 +596,23 @@
         </w:rPr>
       </w:pPr>
     </w:p>
+    <w:p>
+      <w:pPr>
+        <w:rPr>
+          <w:rFonts w:ascii="Calibri" w:hAnsi="Calibri" w:cs="Calibri"/>
+        </w:rPr>
+      </w:pPr>
+    </w:p>
+    <w:p>
+      <w:pPr>
+        <w:rPr>
+          <w:rFonts w:ascii="Calibri" w:hAnsi="Calibri" w:cs="Calibri"/>
+        </w:rPr>
+      </w:pPr>
+    </w:p>
     <w:sectPr>
       <w:footerReference w:type="default" r:id="rId8"/>
-      <w:pgSz w:w="12240" w:h="15840"/>
+      <w:pgSz w:w="12240" w:h="15840" w:orient="portrait"/>
       <w:pgMar w:top="1008" w:right="1440" w:bottom="1440" w:left="1440" w:header="720" w:footer="720" w:gutter="0"/>
       <w:cols w:space="720"/>
       <w:docGrid w:linePitch="360"/>
@@ -833,7 +847,7 @@
         <w:ind w:left="720" w:hanging="360"/>
       </w:pPr>
       <w:rPr>
-        <w:rFonts w:ascii="Symbol" w:hAnsi="Symbol" w:hint="default"/>
+        <w:rFonts w:hint="default" w:ascii="Symbol" w:hAnsi="Symbol"/>
       </w:rPr>
     </w:lvl>
     <w:lvl w:ilvl="1" w:tplc="04090003" w:tentative="1">
@@ -848,7 +862,7 @@
         <w:ind w:left="1440" w:hanging="360"/>
       </w:pPr>
       <w:rPr>
-        <w:rFonts w:ascii="Courier New" w:hAnsi="Courier New" w:cs="Courier New" w:hint="default"/>
+        <w:rFonts w:hint="default" w:ascii="Courier New" w:hAnsi="Courier New" w:cs="Courier New"/>
       </w:rPr>
     </w:lvl>
     <w:lvl w:ilvl="2" w:tplc="04090005" w:tentative="1">
@@ -863,7 +877,7 @@
         <w:ind w:left="2160" w:hanging="360"/>
       </w:pPr>
       <w:rPr>
-        <w:rFonts w:ascii="Wingdings" w:hAnsi="Wingdings" w:hint="default"/>
+        <w:rFonts w:hint="default" w:ascii="Wingdings" w:hAnsi="Wingdings"/>
       </w:rPr>
     </w:lvl>
     <w:lvl w:ilvl="3" w:tplc="04090001" w:tentative="1">
@@ -878,7 +892,7 @@
         <w:ind w:left="2880" w:hanging="360"/>
       </w:pPr>
       <w:rPr>
-        <w:rFonts w:ascii="Symbol" w:hAnsi="Symbol" w:hint="default"/>
+        <w:rFonts w:hint="default" w:ascii="Symbol" w:hAnsi="Symbol"/>
       </w:rPr>
     </w:lvl>
     <w:lvl w:ilvl="4" w:tplc="04090003" w:tentative="1">
@@ -893,7 +907,7 @@
         <w:ind w:left="3600" w:hanging="360"/>
       </w:pPr>
       <w:rPr>
-        <w:rFonts w:ascii="Courier New" w:hAnsi="Courier New" w:cs="Courier New" w:hint="default"/>
+        <w:rFonts w:hint="default" w:ascii="Courier New" w:hAnsi="Courier New" w:cs="Courier New"/>
       </w:rPr>
     </w:lvl>
     <w:lvl w:ilvl="5" w:tplc="04090005" w:tentative="1">
@@ -908,7 +922,7 @@
         <w:ind w:left="4320" w:hanging="360"/>
       </w:pPr>
       <w:rPr>
-        <w:rFonts w:ascii="Wingdings" w:hAnsi="Wingdings" w:hint="default"/>
+        <w:rFonts w:hint="default" w:ascii="Wingdings" w:hAnsi="Wingdings"/>
       </w:rPr>
     </w:lvl>
     <w:lvl w:ilvl="6" w:tplc="04090001" w:tentative="1">
@@ -923,7 +937,7 @@
         <w:ind w:left="5040" w:hanging="360"/>
       </w:pPr>
       <w:rPr>
-        <w:rFonts w:ascii="Symbol" w:hAnsi="Symbol" w:hint="default"/>
+        <w:rFonts w:hint="default" w:ascii="Symbol" w:hAnsi="Symbol"/>
       </w:rPr>
     </w:lvl>
     <w:lvl w:ilvl="7" w:tplc="04090003" w:tentative="1">
@@ -938,7 +952,7 @@
         <w:ind w:left="5760" w:hanging="360"/>
       </w:pPr>
       <w:rPr>
-        <w:rFonts w:ascii="Courier New" w:hAnsi="Courier New" w:cs="Courier New" w:hint="default"/>
+        <w:rFonts w:hint="default" w:ascii="Courier New" w:hAnsi="Courier New" w:cs="Courier New"/>
       </w:rPr>
     </w:lvl>
     <w:lvl w:ilvl="8" w:tplc="04090005" w:tentative="1">
@@ -953,7 +967,7 @@
         <w:ind w:left="6480" w:hanging="360"/>
       </w:pPr>
       <w:rPr>
-        <w:rFonts w:ascii="Wingdings" w:hAnsi="Wingdings" w:hint="default"/>
+        <w:rFonts w:hint="default" w:ascii="Wingdings" w:hAnsi="Wingdings"/>
       </w:rPr>
     </w:lvl>
   </w:abstractNum>
@@ -968,7 +982,7 @@
   <w:docDefaults>
     <w:rPrDefault>
       <w:rPr>
-        <w:rFonts w:ascii="Times New Roman" w:eastAsia="Times New Roman" w:hAnsi="Times New Roman" w:cs="Times New Roman"/>
+        <w:rFonts w:ascii="Times New Roman" w:hAnsi="Times New Roman" w:eastAsia="Times New Roman" w:cs="Times New Roman"/>
         <w:lang w:val="en-US" w:eastAsia="en-US" w:bidi="ar-SA"/>
       </w:rPr>
     </w:rPrDefault>
@@ -1034,7 +1048,7 @@
     <w:lsdException w:name="Table Web 2" w:semiHidden="1" w:unhideWhenUsed="1"/>
     <w:lsdException w:name="Table Web 3" w:semiHidden="1" w:unhideWhenUsed="1"/>
     <w:lsdException w:name="Table Theme" w:semiHidden="1" w:unhideWhenUsed="1"/>
-    <w:lsdException w:name="Placeholder Text" w:semiHidden="1" w:uiPriority="99"/>
+    <w:lsdException w:name="Placeholder Text" w:uiPriority="99" w:semiHidden="1"/>
     <w:lsdException w:name="No Spacing" w:uiPriority="1" w:qFormat="1"/>
     <w:lsdException w:name="Light Shading" w:uiPriority="60"/>
     <w:lsdException w:name="Light List" w:uiPriority="61"/>
@@ -1056,7 +1070,7 @@
     <w:lsdException w:name="Medium Shading 1 Accent 1" w:uiPriority="63"/>
     <w:lsdException w:name="Medium Shading 2 Accent 1" w:uiPriority="64"/>
     <w:lsdException w:name="Medium List 1 Accent 1" w:uiPriority="65"/>
-    <w:lsdException w:name="Revision" w:semiHidden="1" w:uiPriority="99"/>
+    <w:lsdException w:name="Revision" w:uiPriority="99" w:semiHidden="1"/>
     <w:lsdException w:name="List Paragraph" w:uiPriority="34" w:qFormat="1"/>
     <w:lsdException w:name="Quote" w:uiPriority="29" w:qFormat="1"/>
     <w:lsdException w:name="Intense Quote" w:uiPriority="30" w:qFormat="1"/>
@@ -1143,8 +1157,8 @@
     <w:lsdException w:name="Subtle Reference" w:uiPriority="31" w:qFormat="1"/>
     <w:lsdException w:name="Intense Reference" w:uiPriority="32" w:qFormat="1"/>
     <w:lsdException w:name="Book Title" w:uiPriority="33" w:qFormat="1"/>
-    <w:lsdException w:name="Bibliography" w:semiHidden="1" w:uiPriority="37" w:unhideWhenUsed="1"/>
-    <w:lsdException w:name="TOC Heading" w:semiHidden="1" w:uiPriority="39" w:unhideWhenUsed="1" w:qFormat="1"/>
+    <w:lsdException w:name="Bibliography" w:uiPriority="37" w:semiHidden="1" w:unhideWhenUsed="1"/>
+    <w:lsdException w:name="TOC Heading" w:uiPriority="39" w:semiHidden="1" w:unhideWhenUsed="1" w:qFormat="1"/>
     <w:lsdException w:name="Plain Table 1" w:uiPriority="41"/>
     <w:lsdException w:name="Plain Table 2" w:uiPriority="42"/>
     <w:lsdException w:name="Plain Table 3" w:uiPriority="43"/>
@@ -1249,13 +1263,13 @@
     <w:lsdException w:name="List Table 5 Dark Accent 6" w:uiPriority="50"/>
     <w:lsdException w:name="List Table 6 Colorful Accent 6" w:uiPriority="51"/>
     <w:lsdException w:name="List Table 7 Colorful Accent 6" w:uiPriority="52"/>
-    <w:lsdException w:name="Mention" w:semiHidden="1" w:uiPriority="99" w:unhideWhenUsed="1"/>
-    <w:lsdException w:name="Smart Hyperlink" w:semiHidden="1" w:uiPriority="99" w:unhideWhenUsed="1"/>
-    <w:lsdException w:name="Hashtag" w:semiHidden="1" w:uiPriority="99" w:unhideWhenUsed="1"/>
-    <w:lsdException w:name="Unresolved Mention" w:semiHidden="1" w:uiPriority="99" w:unhideWhenUsed="1"/>
-    <w:lsdException w:name="Smart Link" w:semiHidden="1" w:uiPriority="99" w:unhideWhenUsed="1"/>
+    <w:lsdException w:name="Mention" w:uiPriority="99" w:semiHidden="1" w:unhideWhenUsed="1"/>
+    <w:lsdException w:name="Smart Hyperlink" w:uiPriority="99" w:semiHidden="1" w:unhideWhenUsed="1"/>
+    <w:lsdException w:name="Hashtag" w:uiPriority="99" w:semiHidden="1" w:unhideWhenUsed="1"/>
+    <w:lsdException w:name="Unresolved Mention" w:uiPriority="99" w:semiHidden="1" w:unhideWhenUsed="1"/>
+    <w:lsdException w:name="Smart Link" w:uiPriority="99" w:semiHidden="1" w:unhideWhenUsed="1"/>
   </w:latentStyles>
-  <w:style w:type="paragraph" w:default="1" w:styleId="Normal">
+  <w:style w:type="paragraph" w:styleId="Normal" w:default="1">
     <w:name w:val="Normal"/>
     <w:qFormat/>
     <w:rsid w:val="00C96CA4"/>
@@ -1264,13 +1278,13 @@
       <w:szCs w:val="24"/>
     </w:rPr>
   </w:style>
-  <w:style w:type="character" w:default="1" w:styleId="DefaultParagraphFont">
+  <w:style w:type="character" w:styleId="DefaultParagraphFont" w:default="1">
     <w:name w:val="Default Paragraph Font"/>
     <w:uiPriority w:val="1"/>
     <w:semiHidden/>
     <w:unhideWhenUsed/>
   </w:style>
-  <w:style w:type="table" w:default="1" w:styleId="TableNormal">
+  <w:style w:type="table" w:styleId="TableNormal" w:default="1">
     <w:name w:val="Normal Table"/>
     <w:uiPriority w:val="99"/>
     <w:semiHidden/>
@@ -1285,7 +1299,7 @@
       </w:tblCellMar>
     </w:tblPr>
   </w:style>
-  <w:style w:type="numbering" w:default="1" w:styleId="NoList">
+  <w:style w:type="numbering" w:styleId="NoList" w:default="1">
     <w:name w:val="No List"/>
     <w:uiPriority w:val="99"/>
     <w:semiHidden/>
@@ -1297,12 +1311,12 @@
     <w:rsid w:val="00C96CA4"/>
     <w:tblPr>
       <w:tblBorders>
-        <w:top w:val="single" w:sz="4" w:space="0" w:color="auto"/>
-        <w:left w:val="single" w:sz="4" w:space="0" w:color="auto"/>
-        <w:bottom w:val="single" w:sz="4" w:space="0" w:color="auto"/>
-        <w:right w:val="single" w:sz="4" w:space="0" w:color="auto"/>
-        <w:insideH w:val="single" w:sz="4" w:space="0" w:color="auto"/>
-        <w:insideV w:val="single" w:sz="4" w:space="0" w:color="auto"/>
+        <w:top w:val="single" w:color="auto" w:sz="4" w:space="0"/>
+        <w:left w:val="single" w:color="auto" w:sz="4" w:space="0"/>
+        <w:bottom w:val="single" w:color="auto" w:sz="4" w:space="0"/>
+        <w:right w:val="single" w:color="auto" w:sz="4" w:space="0"/>
+        <w:insideH w:val="single" w:color="auto" w:sz="4" w:space="0"/>
+        <w:insideV w:val="single" w:color="auto" w:sz="4" w:space="0"/>
       </w:tblBorders>
     </w:tblPr>
   </w:style>
@@ -1344,7 +1358,7 @@
       <w:szCs w:val="16"/>
     </w:rPr>
   </w:style>
-  <w:style w:type="character" w:customStyle="1" w:styleId="ITCVName">
+  <w:style w:type="character" w:styleId="ITCVName" w:customStyle="1">
     <w:name w:val="ITCV Name"/>
     <w:basedOn w:val="Strong"/>
     <w:uiPriority w:val="1"/>
@@ -1376,7 +1390,7 @@
 </file>
 
 <file path=word/theme/theme1.xml><?xml version="1.0" encoding="utf-8"?>
-<a:theme xmlns:a="http://schemas.openxmlformats.org/drawingml/2006/main" name="Office Theme">
+<a:theme xmlns:a="http://schemas.openxmlformats.org/drawingml/2006/main" xmlns:thm15="http://schemas.microsoft.com/office/thememl/2012/main" name="Office Theme">
   <a:themeElements>
     <a:clrScheme name="Office">
       <a:dk1>

</xml_diff>